<commit_message>
docs: add team members (Najimdeen Adam Oyeyemi & Olagunju Temitope) and enterprise tech stack across all submission files and pitch decks
</commit_message>
<xml_diff>
--- a/submission/SANAD_Executive_Submission_Dossier_Warba_Bank.docx
+++ b/submission/SANAD_Executive_Submission_Dossier_Warba_Bank.docx
@@ -71,6 +71,10 @@
                 <w:color w:val="1E293B"/>
                 <w:sz w:val="20"/>
               </w:rPr>
+              <w:t>👥 Core Engineering Team: Najimdeen Adam Oyeyemi &amp; Olagunju Temitope</w:t>
+              <w:br/>
+              <w:t>💻 Technology Stack: React 19, TypeScript, Vite, Tailwind CSS, Python (FastAPI), Google Gemini 2.5, Uvicorn, Docker, Netlify, Railway</w:t>
+              <w:br/>
               <w:t>🌐 Live Production Application: https://sanad-engine.netlify.app</w:t>
               <w:br/>
               <w:t>⚡ High-Availability Backend API: https://sanad-production-9d51.up.railway.app/health</w:t>
@@ -1575,7 +1579,202 @@
           <w:color w:val="0F172A"/>
           <w:sz w:val="36"/>
         </w:rPr>
-        <w:t>8. Production Readiness &amp; 60-Second Evaluation Protocol</w:t>
+        <w:t>8. Core Team &amp; Technology Stack</w:t>
+      </w:r>
+    </w:p>
+    <w:p/>
+    <w:p>
+      <w:r>
+        <w:rPr>
+          <w:rFonts w:ascii="Calibri" w:hAnsi="Calibri"/>
+          <w:i w:val="0"/>
+          <w:color w:val="1E293B"/>
+          <w:sz w:val="22"/>
+        </w:rPr>
+        <w:t>SANAD was engineered from the ground up for the Warba Bank Corporate Banking AI Challenge 2026 by an agile financial technology engineering team:</w:t>
+      </w:r>
+    </w:p>
+    <w:p>
+      <w:pPr>
+        <w:pStyle w:val="ListBullet"/>
+      </w:pPr>
+      <w:r>
+        <w:rPr>
+          <w:rFonts w:ascii="Calibri" w:hAnsi="Calibri"/>
+          <w:b/>
+          <w:color w:val="0F172A"/>
+          <w:sz w:val="22"/>
+        </w:rPr>
+        <w:t xml:space="preserve">Najimdeen Adam Oyeyemi: </w:t>
+      </w:r>
+      <w:r>
+        <w:rPr>
+          <w:rFonts w:ascii="Calibri" w:hAnsi="Calibri"/>
+          <w:color w:val="1E293B"/>
+          <w:sz w:val="22"/>
+        </w:rPr>
+        <w:t>Lead AI &amp; Financial Architecture Engineer — Spearheaded autonomous Google Gemini reasoning pipelines, adversarial document circularization, and AAOIFI deterministic Shariah accounting engine.</w:t>
+      </w:r>
+    </w:p>
+    <w:p>
+      <w:pPr>
+        <w:pStyle w:val="ListBullet"/>
+      </w:pPr>
+      <w:r>
+        <w:rPr>
+          <w:rFonts w:ascii="Calibri" w:hAnsi="Calibri"/>
+          <w:b/>
+          <w:color w:val="0F172A"/>
+          <w:sz w:val="22"/>
+        </w:rPr>
+        <w:t xml:space="preserve">Olagunju Temitope: </w:t>
+      </w:r>
+      <w:r>
+        <w:rPr>
+          <w:rFonts w:ascii="Calibri" w:hAnsi="Calibri"/>
+          <w:color w:val="1E293B"/>
+          <w:sz w:val="22"/>
+        </w:rPr>
+        <w:t>Full-Stack &amp; Systems Infrastructure Engineer — Built the high-availability FastAPI backend, cryptographic governance ledger, responsive institutional frontend, and zero-downtime deployment infrastructure.</w:t>
+      </w:r>
+    </w:p>
+    <w:p>
+      <w:pPr>
+        <w:pStyle w:val="Heading2"/>
+      </w:pPr>
+      <w:r>
+        <w:rPr>
+          <w:rFonts w:ascii="Calibri" w:hAnsi="Calibri"/>
+          <w:b/>
+          <w:color w:val="2563EB"/>
+          <w:sz w:val="26"/>
+        </w:rPr>
+        <w:t>Enterprise Technology Stack:</w:t>
+      </w:r>
+    </w:p>
+    <w:p>
+      <w:pPr>
+        <w:pStyle w:val="ListBullet"/>
+      </w:pPr>
+      <w:r>
+        <w:rPr>
+          <w:rFonts w:ascii="Calibri" w:hAnsi="Calibri"/>
+          <w:b/>
+          <w:color w:val="0F172A"/>
+          <w:sz w:val="22"/>
+        </w:rPr>
+        <w:t xml:space="preserve">Frontend Architecture: </w:t>
+      </w:r>
+      <w:r>
+        <w:rPr>
+          <w:rFonts w:ascii="Calibri" w:hAnsi="Calibri"/>
+          <w:color w:val="1E293B"/>
+          <w:sz w:val="22"/>
+        </w:rPr>
+        <w:t>React 19, TypeScript, Vite, Tailwind CSS, Lucide Icons, Canvas-Confetti, Recharts financial data visualization.</w:t>
+      </w:r>
+    </w:p>
+    <w:p>
+      <w:pPr>
+        <w:pStyle w:val="ListBullet"/>
+      </w:pPr>
+      <w:r>
+        <w:rPr>
+          <w:rFonts w:ascii="Calibri" w:hAnsi="Calibri"/>
+          <w:b/>
+          <w:color w:val="0F172A"/>
+          <w:sz w:val="22"/>
+        </w:rPr>
+        <w:t xml:space="preserve">Backend &amp; Microservices: </w:t>
+      </w:r>
+      <w:r>
+        <w:rPr>
+          <w:rFonts w:ascii="Calibri" w:hAnsi="Calibri"/>
+          <w:color w:val="1E293B"/>
+          <w:sz w:val="22"/>
+        </w:rPr>
+        <w:t>Python 3.11, FastAPI, Uvicorn ASGI server, Pydantic data schemas, python-docx, python-pptx, ReportLab.</w:t>
+      </w:r>
+    </w:p>
+    <w:p>
+      <w:pPr>
+        <w:pStyle w:val="ListBullet"/>
+      </w:pPr>
+      <w:r>
+        <w:rPr>
+          <w:rFonts w:ascii="Calibri" w:hAnsi="Calibri"/>
+          <w:b/>
+          <w:color w:val="0F172A"/>
+          <w:sz w:val="22"/>
+        </w:rPr>
+        <w:t xml:space="preserve">Artificial Intelligence &amp; LLM Engine: </w:t>
+      </w:r>
+      <w:r>
+        <w:rPr>
+          <w:rFonts w:ascii="Calibri" w:hAnsi="Calibri"/>
+          <w:color w:val="1E293B"/>
+          <w:sz w:val="22"/>
+        </w:rPr>
+        <w:t>Google Gemini 2.5 Flash / Pro (multi-modal document reasoning, unscripted credit analysis, and automated multi-chapter synthesis).</w:t>
+      </w:r>
+    </w:p>
+    <w:p>
+      <w:pPr>
+        <w:pStyle w:val="ListBullet"/>
+      </w:pPr>
+      <w:r>
+        <w:rPr>
+          <w:rFonts w:ascii="Calibri" w:hAnsi="Calibri"/>
+          <w:b/>
+          <w:color w:val="0F172A"/>
+          <w:sz w:val="22"/>
+        </w:rPr>
+        <w:t xml:space="preserve">Security &amp; Privacy: </w:t>
+      </w:r>
+      <w:r>
+        <w:rPr>
+          <w:rFonts w:ascii="Calibri" w:hAnsi="Calibri"/>
+          <w:color w:val="1E293B"/>
+          <w:sz w:val="22"/>
+        </w:rPr>
+        <w:t>On-Premises Regex &amp; Named-Entity Recognition (NER) Sovereign Redaction Shield for CBK Civil ID and PII protection.</w:t>
+      </w:r>
+    </w:p>
+    <w:p>
+      <w:pPr>
+        <w:pStyle w:val="ListBullet"/>
+      </w:pPr>
+      <w:r>
+        <w:rPr>
+          <w:rFonts w:ascii="Calibri" w:hAnsi="Calibri"/>
+          <w:b/>
+          <w:color w:val="0F172A"/>
+          <w:sz w:val="22"/>
+        </w:rPr>
+        <w:t xml:space="preserve">Deployment &amp; Cloud Infrastructure: </w:t>
+      </w:r>
+      <w:r>
+        <w:rPr>
+          <w:rFonts w:ascii="Calibri" w:hAnsi="Calibri"/>
+          <w:color w:val="1E293B"/>
+          <w:sz w:val="22"/>
+        </w:rPr>
+        <w:t>Railway (Production API &amp; Containerized Python Service), Netlify (Global CDN Edge Hosting for Web Platform), Git / GitHub.</w:t>
+      </w:r>
+    </w:p>
+    <w:p/>
+    <w:p>
+      <w:pPr>
+        <w:pStyle w:val="Heading1"/>
+      </w:pPr>
+      <w:r>
+        <w:rPr>
+          <w:rFonts w:ascii="Calibri" w:hAnsi="Calibri"/>
+          <w:b/>
+          <w:color w:val="0F172A"/>
+          <w:sz w:val="36"/>
+        </w:rPr>
+        <w:t>9. Production Readiness &amp; 60-Second Evaluation Protocol</w:t>
       </w:r>
     </w:p>
     <w:p/>

</xml_diff>